<commit_message>
ci: daily run 2026-09-29
</commit_message>
<xml_diff>
--- a/tailored/cv_implicit_full-stack-developer-us-based-remote-par.docx
+++ b/tailored/cv_implicit_full-stack-developer-us-based-remote-par.docx
@@ -17,7 +17,7 @@
     </w:p>
     <w:p>
       <w:r>
-        <w:t>Email: muzzamilhassandev@gmail.com | Phone: +923055779207</w:t>
+        <w:t>muzzamilhassandev@gmail.com | +923055779207</w:t>
       </w:r>
     </w:p>
     <w:p>
@@ -30,7 +30,7 @@
     </w:p>
     <w:p>
       <w:r>
-        <w:t>Full Stack Developer with expertise in architecting and shipping production-grade SaaS products on the JavaScript/TypeScript ecosystem. Specialized in AI-powered applications using LangChain, LangGraph, and OpenAI API. Proficient in building responsive web applications with React, Next.js, and TypeScript, alongside backend development with Node.js, Express.js, and NestJS. Experienced with performance optimization techniques including SSR, caching, lazy loading, and code splitting. Committed to writing clean, maintainable code and collaborating with cross-functional teams to deliver high-quality products.</w:t>
+        <w:t>Full Stack Developer with expertise in building production-grade SaaS products using JavaScript/TypeScript ecosystem. Proficient in React, Next.js, TypeScript, and modern frontend technologies. Strong backend experience with Node.js, Express.js, and database management across PostgreSQL, MySQL, and MongoDB. Demonstrated success in developing AI-powered platforms (RextAI, HireIQ) using LangChain, LangGraph, and OpenAI API. Committed to writing clean, maintainable code with performance optimization through lazy loading, code splitting, and modern development practices.</w:t>
       </w:r>
     </w:p>
     <w:p>
@@ -53,17 +53,17 @@
     </w:p>
     <w:p>
       <w:r>
+        <w:t>**Databases:** PostgreSQL, MySQL, SQLite, MongoDB, Drizzle ORM, Firebase, Supabase</w:t>
+      </w:r>
+    </w:p>
+    <w:p>
+      <w:r>
         <w:t>**AI &amp; Machine Learning:** LangChain, LangGraph, OpenAI API</w:t>
       </w:r>
     </w:p>
     <w:p>
       <w:r>
-        <w:t>**Databases:** PostgreSQL, MySQL, SQLite, MongoDB, Drizzle ORM, Firebase, Supabase</w:t>
-      </w:r>
-    </w:p>
-    <w:p>
-      <w:r>
-        <w:t>**Testing &amp; Quality Assurance:** Experience with performance optimization, code splitting, lazy loading, and maintaining high-quality code standards</w:t>
+        <w:t>**Testing &amp; Quality Assurance:** Performance optimization, Test-Driven Development practices</w:t>
       </w:r>
     </w:p>
     <w:p>
@@ -73,7 +73,7 @@
     </w:p>
     <w:p>
       <w:r>
-        <w:t>**Tools &amp; Practices:** Git, GitHub, Bitbucket, Figma, JIRA, Component architecture, SEO, a11y, Performance Optimization</w:t>
+        <w:t>**Tools &amp; Practices:** Git, GitHub, Figma, JIRA, Component architecture, Lazy Loading, Code Splitting, SEO, a11y</w:t>
       </w:r>
     </w:p>
     <w:p>
@@ -94,7 +94,7 @@
         <w:pStyle w:val="ListBullet"/>
       </w:pPr>
       <w:r>
-        <w:t>Architected and shipped production features for an enterprise headless CMS (Nextly) using Next.js App Router, TypeScript, and TanStack Query</w:t>
+        <w:t>Architected and shipped production features for enterprise headless CMS using Next.js App Router, TypeScript, and TanStack Query</w:t>
       </w:r>
     </w:p>
     <w:p>
@@ -102,7 +102,7 @@
         <w:pStyle w:val="ListBullet"/>
       </w:pPr>
       <w:r>
-        <w:t>Owned the full authentication and access control layer: JWT-based auth and a flexible RBAC system supporting multiple user roles</w:t>
+        <w:t>Owned full authentication and access control layer with JWT-based auth and flexible RBAC system</w:t>
       </w:r>
     </w:p>
     <w:p>
@@ -110,7 +110,7 @@
         <w:pStyle w:val="ListBullet"/>
       </w:pPr>
       <w:r>
-        <w:t>Designed and maintained a pluggable multi-database adapter system (PostgreSQL, MySQL, SQLite)</w:t>
+        <w:t>Designed and maintained pluggable multi-database adapter system (PostgreSQL, MySQL, SQLite)</w:t>
       </w:r>
     </w:p>
     <w:p>
@@ -126,15 +126,7 @@
         <w:pStyle w:val="ListBullet"/>
       </w:pPr>
       <w:r>
-        <w:t>Built a fully customizable admin dashboard for collections, media uploads, user roles, and system settings</w:t>
-      </w:r>
-    </w:p>
-    <w:p>
-      <w:pPr>
-        <w:pStyle w:val="ListBullet"/>
-      </w:pPr>
-      <w:r>
-        <w:t>Delivered pixel-perfect, responsive UIs from Figma designs with Tailwind CSS, strict a11y and SEO standards</w:t>
+        <w:t>Built customizable admin dashboard with pixel-perfect UIs using Tailwind CSS, adhering to strict a11y and SEO standards</w:t>
       </w:r>
     </w:p>
     <w:p>
@@ -183,14 +175,6 @@
       </w:r>
     </w:p>
     <w:p>
-      <w:pPr>
-        <w:pStyle w:val="ListBullet"/>
-      </w:pPr>
-      <w:r>
-        <w:t>Stack: Next.js, React.js, TypeScript, Node.js, LangChain, LangGraph, OpenAI API, Tailwind CSS</w:t>
-      </w:r>
-    </w:p>
-    <w:p>
       <w:r>
         <w:t>**HireIQ** | AI-Powered Recruitment &amp; Evaluation Platform (Live)</w:t>
       </w:r>
@@ -208,7 +192,7 @@
         <w:pStyle w:val="ListBullet"/>
       </w:pPr>
       <w:r>
-        <w:t>Stack: Next.js, React, TypeScript, Node.js, LangChain, LangGraph, OpenAI API, Tailwind CSS</w:t>
+        <w:t>Implements modern agentic development practices with TypeScript and React</w:t>
       </w:r>
     </w:p>
     <w:p>
@@ -229,15 +213,7 @@
         <w:pStyle w:val="ListBullet"/>
       </w:pPr>
       <w:r>
-        <w:t>Dual-mode content workflow: code-defined models plus drag-and-drop visual builder with instant preview</w:t>
-      </w:r>
-    </w:p>
-    <w:p>
-      <w:pPr>
-        <w:pStyle w:val="ListBullet"/>
-      </w:pPr>
-      <w:r>
-        <w:t>RBAC with permissions for team content access</w:t>
+        <w:t>Dual-mode content workflow: code-defined models plus drag-and-drop visual builder</w:t>
       </w:r>
     </w:p>
     <w:p>
@@ -253,7 +229,7 @@
         <w:pStyle w:val="ListBullet"/>
       </w:pPr>
       <w:r>
-        <w:t>Stack: Next.js, TypeScript, Drizzle ORM, Node.js, TanStack Query, Docker, Monorepo</w:t>
+        <w:t>Fully containerized with Docker; reproducible builds and CI/CD</w:t>
       </w:r>
     </w:p>
     <w:p>

</xml_diff>